<commit_message>
Rewrite TOR Word doc to match the given template structure
</commit_message>
<xml_diff>
--- a/docs/tor/report.docx
+++ b/docs/tor/report.docx
@@ -19,6 +19,32 @@
     </w:p>
     <w:p>
       <w:pPr>
+        <w:spacing w:after="30" w:before="0" w:line="288"/>
+      </w:pPr>
+      <w:r>
+        <w:rPr>
+          <w:rFonts w:ascii="Tahoma" w:cs="Tahoma" w:eastAsia="Tahoma" w:hAnsi="Tahoma"/>
+          <w:sz w:val="22"/>
+          <w:szCs w:val="22"/>
+        </w:rPr>
+        <w:t xml:space="preserve"/>
+      </w:r>
+    </w:p>
+    <w:p>
+      <w:pPr>
+        <w:spacing w:after="60" w:before="0" w:line="288"/>
+      </w:pPr>
+      <w:r>
+        <w:rPr>
+          <w:rFonts w:ascii="Tahoma" w:cs="Tahoma" w:eastAsia="Tahoma" w:hAnsi="Tahoma"/>
+          <w:sz w:val="22"/>
+          <w:szCs w:val="22"/>
+        </w:rPr>
+        <w:t xml:space="preserve">โครงการ: ระบบ UP Drive — แอปพลิเคชันแชร์ค่าเดินทางสำหรับนักศึกษา มหาวิทยาลัยพะเยา</w:t>
+      </w:r>
+    </w:p>
+    <w:p>
+      <w:pPr>
         <w:spacing w:after="20" w:before="0" w:line="288"/>
       </w:pPr>
       <w:r>
@@ -27,34 +53,6 @@
           <w:sz w:val="22"/>
           <w:szCs w:val="22"/>
         </w:rPr>
-        <w:t xml:space="preserve"/>
-      </w:r>
-    </w:p>
-    <w:p>
-      <w:pPr>
-        <w:spacing w:after="60" w:before="0" w:line="288"/>
-      </w:pPr>
-      <w:r>
-        <w:rPr>
-          <w:rFonts w:ascii="Tahoma" w:cs="Tahoma" w:eastAsia="Tahoma" w:hAnsi="Tahoma"/>
-          <w:color w:val="334155"/>
-          <w:sz w:val="23"/>
-          <w:szCs w:val="23"/>
-        </w:rPr>
-        <w:t xml:space="preserve">โครงการ: ระบบ UP Drive — แอปพลิเคชันแชร์ค่าเดินทางสำหรับนักศึกษา มหาวิทยาลัยพะเยา</w:t>
-      </w:r>
-    </w:p>
-    <w:p>
-      <w:pPr>
-        <w:spacing w:after="20" w:before="0" w:line="288"/>
-      </w:pPr>
-      <w:r>
-        <w:rPr>
-          <w:rFonts w:ascii="Tahoma" w:cs="Tahoma" w:eastAsia="Tahoma" w:hAnsi="Tahoma"/>
-          <w:color w:val="6B7688"/>
-          <w:sz w:val="21"/>
-          <w:szCs w:val="21"/>
-        </w:rPr>
         <w:t xml:space="preserve">ผู้ทำงาน: ______________________________ รหัสนิสิต ______________________</w:t>
       </w:r>
     </w:p>
@@ -65,11 +63,10 @@
       <w:r>
         <w:rPr>
           <w:rFonts w:ascii="Tahoma" w:cs="Tahoma" w:eastAsia="Tahoma" w:hAnsi="Tahoma"/>
-          <w:color w:val="6B7688"/>
-          <w:sz w:val="21"/>
-          <w:szCs w:val="21"/>
-        </w:rPr>
-        <w:t xml:space="preserve">____________________ ______________________________ รหัสนิสิต ______________________</w:t>
+          <w:sz w:val="22"/>
+          <w:szCs w:val="22"/>
+        </w:rPr>
+        <w:t xml:space="preserve">________________ ______________________________ รหัสนิสิต ______________________</w:t>
       </w:r>
     </w:p>
     <w:p>
@@ -97,33 +94,7 @@
           <w:sz w:val="22"/>
           <w:szCs w:val="22"/>
         </w:rPr>
-        <w:t xml:space="preserve">ปัจจุบันนักศึกษามหาวิทยาลัยพะเยาส่วนใหญ่เดินทางระหว่างที่พัก (ในตัวเมืองพะเยาและชุมชนรอบมหาวิทยาลัย) กับมหาวิทยาลัยด้วยรถยนต์ส่วนตัวหรือรถจักรยานยนต์ โดยมักเดินทางเพียงคนเดียวในแต่ละเที่ยว ส่งผลให้สิ้นเปลืองค่าเชื้อเพลิงและค่าใช้จ่ายในการเดินทางเป็นรายวัน อีกทั้งยังเพิ่มปริมาณรถบนท้องถนนและบริเวณทางเข้ามหาวิทยาลัย แม้ว่านักศึกษาหลายคนจะมีเส้นทางและช่วงเวลาเดินทางที่ใกล้เคียงกันก็ตาม</w:t>
-      </w:r>
-    </w:p>
-    <w:p>
-      <w:pPr>
-        <w:spacing w:after="100" w:before="0" w:line="288"/>
-      </w:pPr>
-      <w:r>
-        <w:rPr>
-          <w:rFonts w:ascii="Tahoma" w:cs="Tahoma" w:eastAsia="Tahoma" w:hAnsi="Tahoma"/>
-          <w:sz w:val="22"/>
-          <w:szCs w:val="22"/>
-        </w:rPr>
-        <w:t xml:space="preserve">ที่ผ่านมาการรวมกลุ่มเดินทางอาศัยการสื่อสารผ่านกลุ่มแชตหรือโซเชียลมีเดีย ซึ่งไม่มีระบบจัดการข้อมูล ไม่สามารถจับคู่เส้นทางที่ใกล้เคียงกันได้อย่างมีประสิทธิภาพ ไม่มีข้อมูลยืนยันตัวตนของผู้ร่วมเดินทาง และไม่มีการติดตามสถานะหรือตำแหน่งการเดินทางที่ชัดเจน ทำให้การรวมกลุ่มทำได้ยากและขาดความน่าเชื่อถือ</w:t>
-      </w:r>
-    </w:p>
-    <w:p>
-      <w:pPr>
-        <w:spacing w:after="100" w:before="0" w:line="288"/>
-      </w:pPr>
-      <w:r>
-        <w:rPr>
-          <w:rFonts w:ascii="Tahoma" w:cs="Tahoma" w:eastAsia="Tahoma" w:hAnsi="Tahoma"/>
-          <w:sz w:val="22"/>
-          <w:szCs w:val="22"/>
-        </w:rPr>
-        <w:t xml:space="preserve">ด้วยเหตุผลดังกล่าว จึงมีความจำเป็นต้องพัฒนาแอปพลิเคชัน “UP Drive” ซึ่งเป็นระบบแชร์ค่าเดินทาง (Carpooling) บนเว็บแอปพลิเคชัน ที่ช่วยให้นักศึกษาประกาศเส้นทางความต้องการเดินทาง จับคู่ผู้ที่ไปทางเดียวกันเป็นกลุ่ม มอบหมายให้คนขับรับงาน และติดตามตำแหน่งแบบเรียลไทม์ เพื่อลดค่าใช้จ่ายในการเดินทาง ลดปริมาณรถ และเพิ่มความสะดวกและความปลอดภัยในการเดินทางร่วมกัน</w:t>
+        <w:t xml:space="preserve">ความเป็นมา: ปัจจุบันนักศึกษามหาวิทยาลัยพะเยาส่วนใหญ่เดินทางระหว่างที่พัก (ในตัวเมืองพะเยาและชุมชนรอบมหาวิทยาลัย) กับมหาวิทยาลัยด้วยรถยนต์ส่วนตัวหรือรถจักรยานยนต์ โดยมักเดินทางเพียงคนเดียวในแต่ละเที่ยว ส่งผลให้สิ้นเปลืองค่าเชื้อเพลิงและค่าใช้จ่ายในการเดินทางเป็นรายวัน อีกทั้งยังเพิ่มปริมาณรถบนท้องถนนและบริเวณทางเข้ามหาวิทยาลัย แม้ว่านักศึกษาหลายคนจะมีเส้นทางและช่วงเวลาเดินทางที่ใกล้เคียงกันก็ตาม ที่ผ่านมาการรวมกลุ่มเดินทางอาศัยการสื่อสารผ่านกลุ่มแชตหรือโซเชียลมีเดีย ซึ่งไม่มีระบบจัดการข้อมูล ไม่สามารถจับคู่เส้นทางที่ใกล้เคียงกันได้อย่างมีประสิทธิภาพ ไม่มีข้อมูลยืนยันตัวตนของผู้ร่วมเดินทาง และไม่มีการติดตามสถานะหรือตำแหน่งการเดินทางที่ชัดเจน จึงเห็นควรพัฒนาแอปพลิเคชัน “UP Drive” ซึ่งเป็นระบบแชร์ค่าเดินทาง (Carpooling) บนเว็บแอปพลิเคชัน ที่ช่วยให้นักศึกษาประกาศเส้นทางความต้องการเดินทาง จับคู่ผู้ที่ไปทางเดียวกันเป็นกลุ่ม มอบหมายให้คนขับรับงาน และติดตามตำแหน่งแบบเรียลไทม์ เพื่อลดค่าใช้จ่ายในการเดินทาง ลดปริมาณรถ และเพิ่มความสะดวกและความปลอดภัยในการเดินทางร่วมกัน</w:t>
       </w:r>
     </w:p>
     <w:p>
@@ -156,52 +127,7 @@
     </w:p>
     <w:p>
       <w:pPr>
-        <w:spacing w:after="90" w:before="220"/>
-      </w:pPr>
-      <w:r>
-        <w:rPr>
-          <w:rFonts w:ascii="Tahoma" w:cs="Tahoma" w:eastAsia="Tahoma" w:hAnsi="Tahoma"/>
-          <w:b/>
-          <w:bCs/>
-          <w:color w:val="5B21B6"/>
-          <w:sz w:val="23"/>
-          <w:szCs w:val="23"/>
-        </w:rPr>
-        <w:t xml:space="preserve">2.1 แพลตฟอร์มที่รองรับ</w:t>
-      </w:r>
-    </w:p>
-    <w:p>
-      <w:pPr>
-        <w:spacing w:after="100" w:before="0" w:line="288"/>
-      </w:pPr>
-      <w:r>
-        <w:rPr>
-          <w:rFonts w:ascii="Tahoma" w:cs="Tahoma" w:eastAsia="Tahoma" w:hAnsi="Tahoma"/>
-          <w:sz w:val="22"/>
-          <w:szCs w:val="22"/>
-        </w:rPr>
-        <w:t xml:space="preserve">Web-application รองรับเว็บเบราว์เซอร์มาตรฐาน (Chrome, Edge, Safari, Firefox) และออกแบบหน้าจอให้แสดงผลได้ดีบนอุปกรณ์มือถือ (Responsive) โดยทำงานร่วมกับฐานข้อมูล PostgreSQL บน Supabase และติดตั้งบนผู้ให้บริการคลาวด์ (Deploy ออนไลน์จริง)</w:t>
-      </w:r>
-    </w:p>
-    <w:p>
-      <w:pPr>
-        <w:spacing w:after="90" w:before="220"/>
-      </w:pPr>
-      <w:r>
-        <w:rPr>
-          <w:rFonts w:ascii="Tahoma" w:cs="Tahoma" w:eastAsia="Tahoma" w:hAnsi="Tahoma"/>
-          <w:b/>
-          <w:bCs/>
-          <w:color w:val="5B21B6"/>
-          <w:sz w:val="23"/>
-          <w:szCs w:val="23"/>
-        </w:rPr>
-        <w:t xml:space="preserve">2.2 คุณลักษณะและฟังก์ชันการทำงานหลัก (Core Features)</w:t>
-      </w:r>
-    </w:p>
-    <w:p>
-      <w:pPr>
-        <w:spacing w:after="60" w:before="160" w:line="288"/>
+        <w:spacing w:after="50" w:before="150" w:line="288"/>
       </w:pPr>
       <w:r>
         <w:rPr>
@@ -212,7 +138,51 @@
           <w:sz w:val="22"/>
           <w:szCs w:val="22"/>
         </w:rPr>
-        <w:t xml:space="preserve">(1) ระบบยืนยันตัวตนและการจัดการบัญชี (Authentication &amp; User Profile)</w:t>
+        <w:t xml:space="preserve">2.1 แพลตฟอร์มที่รองรับ</w:t>
+      </w:r>
+    </w:p>
+    <w:p>
+      <w:pPr>
+        <w:spacing w:after="100" w:before="0" w:line="288"/>
+      </w:pPr>
+      <w:r>
+        <w:rPr>
+          <w:rFonts w:ascii="Tahoma" w:cs="Tahoma" w:eastAsia="Tahoma" w:hAnsi="Tahoma"/>
+          <w:sz w:val="22"/>
+          <w:szCs w:val="22"/>
+        </w:rPr>
+        <w:t xml:space="preserve">Web-application รองรับเว็บเบราว์เซอร์มาตรฐาน (Chrome, Edge, Safari, Firefox)</w:t>
+      </w:r>
+    </w:p>
+    <w:p>
+      <w:pPr>
+        <w:spacing w:after="50" w:before="150" w:line="288"/>
+      </w:pPr>
+      <w:r>
+        <w:rPr>
+          <w:rFonts w:ascii="Tahoma" w:cs="Tahoma" w:eastAsia="Tahoma" w:hAnsi="Tahoma"/>
+          <w:b/>
+          <w:bCs/>
+          <w:color w:val="334155"/>
+          <w:sz w:val="22"/>
+          <w:szCs w:val="22"/>
+        </w:rPr>
+        <w:t xml:space="preserve">2.2 คุณลักษณะและฟังก์ชันการทำงานหลัก (Core Features)</w:t>
+      </w:r>
+    </w:p>
+    <w:p>
+      <w:pPr>
+        <w:spacing w:after="40" w:before="100" w:line="288"/>
+      </w:pPr>
+      <w:r>
+        <w:rPr>
+          <w:rFonts w:ascii="Tahoma" w:cs="Tahoma" w:eastAsia="Tahoma" w:hAnsi="Tahoma"/>
+          <w:b/>
+          <w:bCs/>
+          <w:sz w:val="22"/>
+          <w:szCs w:val="22"/>
+        </w:rPr>
+        <w:t xml:space="preserve">ระบบยืนยันตัวตนและการจัดการบัญชี (Authentication &amp; User Profile):</w:t>
       </w:r>
     </w:p>
     <w:p>
@@ -230,7 +200,7 @@
           <w:sz w:val="22"/>
           <w:szCs w:val="22"/>
         </w:rPr>
-        <w:t xml:space="preserve">การลงทะเบียนและเข้าสู่ระบบด้วยอีเมลและรหัสผ่าน (Email/Password)</w:t>
+        <w:t xml:space="preserve">การลงทะเบียนและเข้าสู่ระบบ (Email/Password, เบอร์โทรศัพท์ผ่าน OTP, หรือ Social Login)</w:t>
       </w:r>
     </w:p>
     <w:p>
@@ -248,7 +218,7 @@
           <w:sz w:val="22"/>
           <w:szCs w:val="22"/>
         </w:rPr>
-        <w:t xml:space="preserve">การจัดการข้อมูลส่วนตัว (ชื่อ เบอร์โทรศัพท์ และข้อมูลยานพาหนะ) และการเปลี่ยนรหัสผ่าน</w:t>
+        <w:t xml:space="preserve">การจัดการข้อมูลส่วนตัว และการเปลี่ยนรหัสผ่าน</w:t>
       </w:r>
     </w:p>
     <w:p>
@@ -266,7 +236,22 @@
           <w:sz w:val="22"/>
           <w:szCs w:val="22"/>
         </w:rPr>
-        <w:t xml:space="preserve">ระบบกำหนดสิทธิ์การใช้งานตามบทบาท (Role-Based Access Control) แยกผู้ใช้ออกเป็นผู้โดยสาร (passenger) และคนขับ (driver)</w:t>
+        <w:t xml:space="preserve">ระบบกำหนดสิทธิ์การใช้งาน (Role-Based Access Control)</w:t>
+      </w:r>
+    </w:p>
+    <w:p>
+      <w:pPr>
+        <w:spacing w:after="40" w:before="140" w:line="288"/>
+      </w:pPr>
+      <w:r>
+        <w:rPr>
+          <w:rFonts w:ascii="Tahoma" w:cs="Tahoma" w:eastAsia="Tahoma" w:hAnsi="Tahoma"/>
+          <w:b/>
+          <w:bCs/>
+          <w:sz w:val="22"/>
+          <w:szCs w:val="22"/>
+        </w:rPr>
+        <w:t xml:space="preserve">ระบบการทำงานหลักของแอปพลิเคชัน (Main Modules):</w:t>
       </w:r>
     </w:p>
     <w:p>
@@ -284,23 +269,7 @@
           <w:sz w:val="22"/>
           <w:szCs w:val="22"/>
         </w:rPr>
-        <w:t xml:space="preserve">การควบคุมความปลอดภัยระดับแถว (Row Level Security) ให้ผู้ใช้เข้าถึงเฉพาะข้อมูลที่เกี่ยวข้องกับตนเอง</w:t>
-      </w:r>
-    </w:p>
-    <w:p>
-      <w:pPr>
-        <w:spacing w:after="60" w:before="160" w:line="288"/>
-      </w:pPr>
-      <w:r>
-        <w:rPr>
-          <w:rFonts w:ascii="Tahoma" w:cs="Tahoma" w:eastAsia="Tahoma" w:hAnsi="Tahoma"/>
-          <w:b/>
-          <w:bCs/>
-          <w:color w:val="334155"/>
-          <w:sz w:val="22"/>
-          <w:szCs w:val="22"/>
-        </w:rPr>
-        <w:t xml:space="preserve">(2) ระบบการทำงานหลักของแอปพลิเคชัน (Main Modules)</w:t>
+        <w:t xml:space="preserve">ระบบประกาศและค้นหาคำขอเดินทาง พร้อมจับคู่ผู้โดยสารที่ไปทางเดียวกันเป็นกลุ่ม (ระบุต้นทาง–ปลายทาง พิกัดบนแผนที่ GPS และจำนวนผู้ร่วมเดินทาง)</w:t>
       </w:r>
     </w:p>
     <w:p>
@@ -315,20 +284,10 @@
       <w:r>
         <w:rPr>
           <w:rFonts w:ascii="Tahoma" w:cs="Tahoma" w:eastAsia="Tahoma" w:hAnsi="Tahoma"/>
-          <w:b/>
-          <w:bCs/>
-          <w:sz w:val="22"/>
-          <w:szCs w:val="22"/>
-        </w:rPr>
-        <w:t xml:space="preserve">ระบบประกาศและค้นหาคำขอเดินทาง</w:t>
-      </w:r>
-      <w:r>
-        <w:rPr>
-          <w:rFonts w:ascii="Tahoma" w:cs="Tahoma" w:eastAsia="Tahoma" w:hAnsi="Tahoma"/>
-          <w:sz w:val="22"/>
-          <w:szCs w:val="22"/>
-        </w:rPr>
-        <w:t xml:space="preserve"> — ผู้โดยสารระบุต้นทาง–ปลายทาง พิกัดบนแผนที่ (GPS) และจำนวนผู้ร่วมเดินทาง</w:t>
+          <w:sz w:val="22"/>
+          <w:szCs w:val="22"/>
+        </w:rPr>
+        <w:t xml:space="preserve">ระบบมอบหมายงานให้คนขับและการจัดการสถานะการเดินทาง (คนขับกดรับงาน พร้อมอัปเดตสถานะกลุ่มตลอดวงจร forming → sent_to_driver → accepted → completed / cancelled)</w:t>
       </w:r>
     </w:p>
     <w:p>
@@ -343,20 +302,25 @@
       <w:r>
         <w:rPr>
           <w:rFonts w:ascii="Tahoma" w:cs="Tahoma" w:eastAsia="Tahoma" w:hAnsi="Tahoma"/>
+          <w:sz w:val="22"/>
+          <w:szCs w:val="22"/>
+        </w:rPr>
+        <w:t xml:space="preserve">ระบบติดตามตำแหน่งคนขับแบบ Realtime และประวัติการเดินทาง (แสดงตำแหน่งบนแผนที่แบบเรียลไทม์ พร้อมเส้นทางและระยะทาง)</w:t>
+      </w:r>
+    </w:p>
+    <w:p>
+      <w:pPr>
+        <w:spacing w:after="40" w:before="140" w:line="288"/>
+      </w:pPr>
+      <w:r>
+        <w:rPr>
+          <w:rFonts w:ascii="Tahoma" w:cs="Tahoma" w:eastAsia="Tahoma" w:hAnsi="Tahoma"/>
           <w:b/>
           <w:bCs/>
           <w:sz w:val="22"/>
           <w:szCs w:val="22"/>
         </w:rPr>
-        <w:t xml:space="preserve">ระบบจับคู่กลุ่มอัตโนมัติ</w:t>
-      </w:r>
-      <w:r>
-        <w:rPr>
-          <w:rFonts w:ascii="Tahoma" w:cs="Tahoma" w:eastAsia="Tahoma" w:hAnsi="Tahoma"/>
-          <w:sz w:val="22"/>
-          <w:szCs w:val="22"/>
-        </w:rPr>
-        <w:t xml:space="preserve"> — จับคู่ผู้โดยสารที่ไปทางเดียวกันเป็นกลุ่ม โดยคำนวณระยะทางและจัดอันดับกลุ่มที่ใกล้ที่สุด</w:t>
+        <w:t xml:space="preserve">ระบบการแจ้งเตือน (Notifications):</w:t>
       </w:r>
     </w:p>
     <w:p>
@@ -371,20 +335,25 @@
       <w:r>
         <w:rPr>
           <w:rFonts w:ascii="Tahoma" w:cs="Tahoma" w:eastAsia="Tahoma" w:hAnsi="Tahoma"/>
+          <w:sz w:val="22"/>
+          <w:szCs w:val="22"/>
+        </w:rPr>
+        <w:t xml:space="preserve">รองรับ Push Notifications และ In-app Notifications</w:t>
+      </w:r>
+    </w:p>
+    <w:p>
+      <w:pPr>
+        <w:spacing w:after="40" w:before="140" w:line="288"/>
+      </w:pPr>
+      <w:r>
+        <w:rPr>
+          <w:rFonts w:ascii="Tahoma" w:cs="Tahoma" w:eastAsia="Tahoma" w:hAnsi="Tahoma"/>
           <w:b/>
           <w:bCs/>
           <w:sz w:val="22"/>
           <w:szCs w:val="22"/>
         </w:rPr>
-        <w:t xml:space="preserve">ระบบมอบหมายงานให้คนขับ</w:t>
-      </w:r>
-      <w:r>
-        <w:rPr>
-          <w:rFonts w:ascii="Tahoma" w:cs="Tahoma" w:eastAsia="Tahoma" w:hAnsi="Tahoma"/>
-          <w:sz w:val="22"/>
-          <w:szCs w:val="22"/>
-        </w:rPr>
-        <w:t xml:space="preserve"> — คนขับดูกลุ่มที่รอรับงานและกดรับงาน พร้อมอัปเดตสถานะกลุ่มตลอดวงจร (forming → sent_to_driver → accepted → completed / cancelled)</w:t>
+        <w:t xml:space="preserve">ระบบจัดการหลังบ้าน (Admin Web Management):</w:t>
       </w:r>
     </w:p>
     <w:p>
@@ -399,20 +368,10 @@
       <w:r>
         <w:rPr>
           <w:rFonts w:ascii="Tahoma" w:cs="Tahoma" w:eastAsia="Tahoma" w:hAnsi="Tahoma"/>
-          <w:b/>
-          <w:bCs/>
-          <w:sz w:val="22"/>
-          <w:szCs w:val="22"/>
-        </w:rPr>
-        <w:t xml:space="preserve">ระบบติดตามตำแหน่งแบบ Realtime</w:t>
-      </w:r>
-      <w:r>
-        <w:rPr>
-          <w:rFonts w:ascii="Tahoma" w:cs="Tahoma" w:eastAsia="Tahoma" w:hAnsi="Tahoma"/>
-          <w:sz w:val="22"/>
-          <w:szCs w:val="22"/>
-        </w:rPr>
-        <w:t xml:space="preserve"> — แสดงตำแหน่งคนขับบนแผนที่แบบเรียลไทม์ พร้อมเส้นทางและระยะทางของกลุ่ม</w:t>
+          <w:sz w:val="22"/>
+          <w:szCs w:val="22"/>
+        </w:rPr>
+        <w:t xml:space="preserve">ระบบดูภาพรวมและสถิติ (Dashboard &amp; Analytics)</w:t>
       </w:r>
     </w:p>
     <w:p>
@@ -427,124 +386,10 @@
       <w:r>
         <w:rPr>
           <w:rFonts w:ascii="Tahoma" w:cs="Tahoma" w:eastAsia="Tahoma" w:hAnsi="Tahoma"/>
-          <w:b/>
-          <w:bCs/>
-          <w:sz w:val="22"/>
-          <w:szCs w:val="22"/>
-        </w:rPr>
-        <w:t xml:space="preserve">ระบบประวัติการเดินทาง</w:t>
-      </w:r>
-      <w:r>
-        <w:rPr>
-          <w:rFonts w:ascii="Tahoma" w:cs="Tahoma" w:eastAsia="Tahoma" w:hAnsi="Tahoma"/>
-          <w:sz w:val="22"/>
-          <w:szCs w:val="22"/>
-        </w:rPr>
-        <w:t xml:space="preserve"> — แสดงรายการและสถานะการเดินทางที่ผ่านมาของผู้ใช้</w:t>
-      </w:r>
-    </w:p>
-    <w:p>
-      <w:pPr>
-        <w:spacing w:after="60" w:before="160" w:line="288"/>
-      </w:pPr>
-      <w:r>
-        <w:rPr>
-          <w:rFonts w:ascii="Tahoma" w:cs="Tahoma" w:eastAsia="Tahoma" w:hAnsi="Tahoma"/>
-          <w:b/>
-          <w:bCs/>
-          <w:color w:val="334155"/>
-          <w:sz w:val="22"/>
-          <w:szCs w:val="22"/>
-        </w:rPr>
-        <w:t xml:space="preserve">(3) ระบบการแจ้งเตือน (Notifications)</w:t>
-      </w:r>
-    </w:p>
-    <w:p>
-      <w:pPr>
-        <w:pStyle w:val="ListParagraph"/>
-        <w:numPr>
-          <w:ilvl w:val="0"/>
-          <w:numId w:val="1"/>
-        </w:numPr>
-        <w:spacing w:after="60" w:line="288"/>
-      </w:pPr>
-      <w:r>
-        <w:rPr>
-          <w:rFonts w:ascii="Tahoma" w:cs="Tahoma" w:eastAsia="Tahoma" w:hAnsi="Tahoma"/>
-          <w:sz w:val="22"/>
-          <w:szCs w:val="22"/>
-        </w:rPr>
-        <w:t xml:space="preserve">การแจ้งเตือนในแอป (In-app Notifications) เมื่อกลุ่มถูกจับคู่ มีคนขับรับงาน หรือสถานะการเดินทางเปลี่ยน โดยอัปเดตแบบเรียลไทม์ผ่าน Supabase Realtime</w:t>
-      </w:r>
-    </w:p>
-    <w:p>
-      <w:pPr>
-        <w:pStyle w:val="ListParagraph"/>
-        <w:numPr>
-          <w:ilvl w:val="0"/>
-          <w:numId w:val="1"/>
-        </w:numPr>
-        <w:spacing w:after="60" w:line="288"/>
-      </w:pPr>
-      <w:r>
-        <w:rPr>
-          <w:rFonts w:ascii="Tahoma" w:cs="Tahoma" w:eastAsia="Tahoma" w:hAnsi="Tahoma"/>
-          <w:sz w:val="22"/>
-          <w:szCs w:val="22"/>
-        </w:rPr>
-        <w:t xml:space="preserve">การแจ้งเตือนบนอุปกรณ์ (Push Notifications) สำหรับเหตุการณ์สำคัญ เช่น เมื่อคนขับรับงานหรือใกล้ถึงจุดรับ</w:t>
-      </w:r>
-    </w:p>
-    <w:p>
-      <w:pPr>
-        <w:spacing w:after="60" w:before="160" w:line="288"/>
-      </w:pPr>
-      <w:r>
-        <w:rPr>
-          <w:rFonts w:ascii="Tahoma" w:cs="Tahoma" w:eastAsia="Tahoma" w:hAnsi="Tahoma"/>
-          <w:b/>
-          <w:bCs/>
-          <w:color w:val="334155"/>
-          <w:sz w:val="22"/>
-          <w:szCs w:val="22"/>
-        </w:rPr>
-        <w:t xml:space="preserve">(4) ระบบจัดการหลังบ้าน (Admin Web Management)</w:t>
-      </w:r>
-    </w:p>
-    <w:p>
-      <w:pPr>
-        <w:pStyle w:val="ListParagraph"/>
-        <w:numPr>
-          <w:ilvl w:val="0"/>
-          <w:numId w:val="1"/>
-        </w:numPr>
-        <w:spacing w:after="60" w:line="288"/>
-      </w:pPr>
-      <w:r>
-        <w:rPr>
-          <w:rFonts w:ascii="Tahoma" w:cs="Tahoma" w:eastAsia="Tahoma" w:hAnsi="Tahoma"/>
-          <w:sz w:val="22"/>
-          <w:szCs w:val="22"/>
-        </w:rPr>
-        <w:t xml:space="preserve">ระบบดูภาพรวมและสถิติ (Dashboard &amp; Analytics) — จำนวนกลุ่ม/เที่ยวการเดินทาง อัตราการจับคู่สำเร็จ และสถิติการใช้งาน</w:t>
-      </w:r>
-    </w:p>
-    <w:p>
-      <w:pPr>
-        <w:pStyle w:val="ListParagraph"/>
-        <w:numPr>
-          <w:ilvl w:val="0"/>
-          <w:numId w:val="1"/>
-        </w:numPr>
-        <w:spacing w:after="60" w:line="288"/>
-      </w:pPr>
-      <w:r>
-        <w:rPr>
-          <w:rFonts w:ascii="Tahoma" w:cs="Tahoma" w:eastAsia="Tahoma" w:hAnsi="Tahoma"/>
-          <w:sz w:val="22"/>
-          <w:szCs w:val="22"/>
-        </w:rPr>
-        <w:t xml:space="preserve">ระบบจัดการข้อมูลผู้ใช้งานและเนื้อหา (Content / User Management)</w:t>
+          <w:sz w:val="22"/>
+          <w:szCs w:val="22"/>
+        </w:rPr>
+        <w:t xml:space="preserve">ระบบจัดการข้อมูลผู้ใช้งานและเนื้อหา (Content/User Management)</w:t>
       </w:r>
     </w:p>
     <w:p>

</xml_diff>